<commit_message>
Release v3.0.4: seating workbench, focus fixes and installer-only distribution
</commit_message>
<xml_diff>
--- a/docs/downloads/会务智办操作手册.docx
+++ b/docs/downloads/会务智办操作手册.docx
@@ -17,12 +17,26 @@
     </w:p>
     <w:p>
       <w:r>
-        <w:t>适用版本 3.0.2    编写日期 2026-09-30</w:t>
+        <w:t>3.0.4    更新日期 2026-10-14</w:t>
       </w:r>
     </w:p>
     <w:p>
       <w:r>
-        <w:t>本手册截图来自当前程序的独立演示环境。姓名、单位和车牌均为虚构示例，不包含真实业务资料或 API Key。截图中的日期、待办数量和进度仅用于演示；浏览器版与桌面版的业务操作相同，窗口外观可能略有不同。点击图片可查看大图，PDF 可放大阅读。</w:t>
+        <w:t>适用范围：</w:t>
+      </w:r>
+      <w:r>
+        <w:rPr>
+          <w:b/>
+        </w:rPr>
+        <w:t>3.0.4 本机安装版及源码</w:t>
+      </w:r>
+      <w:r>
+        <w:t>。更新日期：2026-10-14。桌面软件仅提供安装程序，安装后通过快捷方式使用。面向日常安排会议、维护名单和跟进会务事项的使用者。</w:t>
+      </w:r>
+    </w:p>
+    <w:p>
+      <w:r>
+        <w:t>本手册截图来自独立演示环境。姓名、单位和车牌均为虚构示例，不包含真实业务资料或 API Key。座次和会议室章节使用 2026-10-08 改版截图，其他未变更章节保留 3.0.2 截图。截图中的日期、待办数量和进度仅用于演示；点击图片可查看大图，PDF 可放大阅读。</w:t>
       </w:r>
     </w:p>
     <w:p>
@@ -31,13 +45,9 @@
       </w:r>
     </w:p>
     <w:p>
-      <w:r>
-        <w:br w:type="page"/>
-      </w:r>
-    </w:p>
-    <w:p>
       <w:pPr>
         <w:pStyle w:val="Heading1"/>
+        <w:pageBreakBefore/>
       </w:pPr>
       <w:r>
         <w:t>目录</w:t>
@@ -284,14 +294,10 @@
       </w:hyperlink>
     </w:p>
     <w:p>
-      <w:r>
-        <w:br w:type="page"/>
-      </w:r>
-    </w:p>
-    <w:p>
       <w:bookmarkStart w:id="1" w:name="chapter_1"/>
       <w:pPr>
         <w:pStyle w:val="Heading1"/>
+        <w:pageBreakBefore/>
       </w:pPr>
       <w:r>
         <w:t>1  启动软件与认识工作台</w:t>
@@ -349,7 +355,7 @@
     </w:p>
     <w:p>
       <w:r>
-        <w:t>1. 安装版：运行发布页的安装程序，安装后从快捷方式启动。便携版：把 EXE 放在可写入的文件夹，双击运行。</w:t>
+        <w:t>1. 从发布页下载安装程序，运行并选择安装目录，安装后从快捷方式启动。升级前先退出旧软件。</w:t>
       </w:r>
     </w:p>
     <w:p>
@@ -375,18 +381,14 @@
     </w:p>
     <w:p>
       <w:r>
-        <w:t>安装版、便携版均自带运行环境，不需要另装 Node.js。GitHub 的 Download ZIP 是源码，不是安装包。</w:t>
-      </w:r>
-    </w:p>
-    <w:p>
-      <w:r>
-        <w:br w:type="page"/>
+        <w:t>安装程序自带运行环境，不需要另装 Node.js。从 3.0.4 正式发布起不再提供便携版。GitHub 的 Download ZIP 是源码，不是安装包。</w:t>
       </w:r>
     </w:p>
     <w:p>
       <w:bookmarkStart w:id="3" w:name="chapter_3"/>
       <w:pPr>
         <w:pStyle w:val="Heading1"/>
+        <w:pageBreakBefore/>
       </w:pPr>
       <w:r>
         <w:t>2  页面切换与未保存内容</w:t>
@@ -431,14 +433,10 @@
       </w:r>
     </w:p>
     <w:p>
-      <w:r>
-        <w:br w:type="page"/>
-      </w:r>
-    </w:p>
-    <w:p>
       <w:bookmarkStart w:id="5" w:name="chapter_5"/>
       <w:pPr>
         <w:pStyle w:val="Heading1"/>
+        <w:pageBreakBefore/>
       </w:pPr>
       <w:r>
         <w:t>3  新建会议 填写基本信息</w:t>
@@ -520,14 +518,10 @@
       </w:r>
     </w:p>
     <w:p>
-      <w:r>
-        <w:br w:type="page"/>
-      </w:r>
-    </w:p>
-    <w:p>
       <w:bookmarkStart w:id="7" w:name="chapter_7"/>
       <w:pPr>
         <w:pStyle w:val="Heading1"/>
+        <w:pageBreakBefore/>
       </w:pPr>
       <w:r>
         <w:t>4  按需要选择会务保障</w:t>
@@ -609,14 +603,10 @@
       </w:r>
     </w:p>
     <w:p>
-      <w:r>
-        <w:br w:type="page"/>
-      </w:r>
-    </w:p>
-    <w:p>
       <w:bookmarkStart w:id="9" w:name="chapter_9"/>
       <w:pPr>
         <w:pStyle w:val="Heading1"/>
+        <w:pageBreakBefore/>
       </w:pPr>
       <w:r>
         <w:t>5  手动录入参会人员</w:t>
@@ -698,14 +688,10 @@
       </w:r>
     </w:p>
     <w:p>
-      <w:r>
-        <w:br w:type="page"/>
-      </w:r>
-    </w:p>
-    <w:p>
       <w:bookmarkStart w:id="11" w:name="chapter_11"/>
       <w:pPr>
         <w:pStyle w:val="Heading1"/>
+        <w:pageBreakBefore/>
       </w:pPr>
       <w:r>
         <w:t>6  从通讯录快速选人</w:t>
@@ -787,14 +773,10 @@
       </w:r>
     </w:p>
     <w:p>
-      <w:r>
-        <w:br w:type="page"/>
-      </w:r>
-    </w:p>
-    <w:p>
       <w:bookmarkStart w:id="13" w:name="chapter_13"/>
       <w:pPr>
         <w:pStyle w:val="Heading1"/>
+        <w:pageBreakBefore/>
       </w:pPr>
       <w:r>
         <w:t>7  查看会议进度与流程核对</w:t>
@@ -885,14 +867,10 @@
       </w:r>
     </w:p>
     <w:p>
-      <w:r>
-        <w:br w:type="page"/>
-      </w:r>
-    </w:p>
-    <w:p>
       <w:bookmarkStart w:id="15" w:name="chapter_15"/>
       <w:pPr>
         <w:pStyle w:val="Heading1"/>
+        <w:pageBreakBefore/>
       </w:pPr>
       <w:r>
         <w:t>8  更新任务与记录办理情况</w:t>
@@ -983,14 +961,10 @@
       </w:r>
     </w:p>
     <w:p>
-      <w:r>
-        <w:br w:type="page"/>
-      </w:r>
-    </w:p>
-    <w:p>
       <w:bookmarkStart w:id="17" w:name="chapter_17"/>
       <w:pPr>
         <w:pStyle w:val="Heading1"/>
+        <w:pageBreakBefore/>
       </w:pPr>
       <w:r>
         <w:t>9  在待办中心集中处理事项</w:t>
@@ -1077,14 +1051,10 @@
       </w:r>
     </w:p>
     <w:p>
-      <w:r>
-        <w:br w:type="page"/>
-      </w:r>
-    </w:p>
-    <w:p>
       <w:bookmarkStart w:id="19" w:name="chapter_19"/>
       <w:pPr>
         <w:pStyle w:val="Heading1"/>
+        <w:pageBreakBefore/>
       </w:pPr>
       <w:r>
         <w:t>10  停车车辆按单位独立登记</w:t>
@@ -1166,14 +1136,10 @@
       </w:r>
     </w:p>
     <w:p>
-      <w:r>
-        <w:br w:type="page"/>
-      </w:r>
-    </w:p>
-    <w:p>
       <w:bookmarkStart w:id="21" w:name="chapter_21"/>
       <w:pPr>
         <w:pStyle w:val="Heading1"/>
+        <w:pageBreakBefore/>
       </w:pPr>
       <w:r>
         <w:t>11  正式名单 选择人员来源</w:t>
@@ -1255,14 +1221,10 @@
       </w:r>
     </w:p>
     <w:p>
-      <w:r>
-        <w:br w:type="page"/>
-      </w:r>
-    </w:p>
-    <w:p>
       <w:bookmarkStart w:id="23" w:name="chapter_23"/>
       <w:pPr>
         <w:pStyle w:val="Heading1"/>
+        <w:pageBreakBefore/>
       </w:pPr>
       <w:r>
         <w:t>12  核对姓名、单位和排序建议</w:t>
@@ -1349,14 +1311,10 @@
       </w:r>
     </w:p>
     <w:p>
-      <w:r>
-        <w:br w:type="page"/>
-      </w:r>
-    </w:p>
-    <w:p>
       <w:bookmarkStart w:id="25" w:name="chapter_25"/>
       <w:pPr>
         <w:pStyle w:val="Heading1"/>
+        <w:pageBreakBefore/>
       </w:pPr>
       <w:r>
         <w:t>13  导出或写回会议名单</w:t>
@@ -1447,14 +1405,10 @@
       </w:r>
     </w:p>
     <w:p>
-      <w:r>
-        <w:br w:type="page"/>
-      </w:r>
-    </w:p>
-    <w:p>
       <w:bookmarkStart w:id="27" w:name="chapter_27"/>
       <w:pPr>
         <w:pStyle w:val="Heading1"/>
+        <w:pageBreakBefore/>
       </w:pPr>
       <w:r>
         <w:t>14  生成并保存座次方案</w:t>
@@ -1469,8 +1423,8 @@
       <w:r>
         <w:drawing>
           <wp:inline xmlns:a="http://schemas.openxmlformats.org/drawingml/2006/main" xmlns:pic="http://schemas.openxmlformats.org/drawingml/2006/picture">
-            <wp:extent cx="5943600" cy="2821107"/>
-            <wp:docPr id="13" name="Picture 13" descr="单中心座次图与主客方"/>
+            <wp:extent cx="3380599" cy="3383280"/>
+            <wp:docPr id="13" name="Picture 13" descr="座次工作台与图上换座"/>
             <wp:cNvGraphicFramePr>
               <a:graphicFrameLocks noChangeAspect="1"/>
             </wp:cNvGraphicFramePr>
@@ -1478,7 +1432,7 @@
               <a:graphicData uri="http://schemas.openxmlformats.org/drawingml/2006/picture">
                 <pic:pic>
                   <pic:nvPicPr>
-                    <pic:cNvPr id="0" name="09-seating-result.jpg"/>
+                    <pic:cNvPr id="0" name="seating-workspace.png"/>
                     <pic:cNvPicPr/>
                   </pic:nvPicPr>
                   <pic:blipFill>
@@ -1490,7 +1444,7 @@
                   <pic:spPr>
                     <a:xfrm>
                       <a:off x="0" y="0"/>
-                      <a:ext cx="5943600" cy="2821107"/>
+                      <a:ext cx="3380599" cy="3383280"/>
                     </a:xfrm>
                     <a:prstGeom prst="rect"/>
                   </pic:spPr>
@@ -1507,12 +1461,12 @@
         <w:jc w:val="center"/>
       </w:pPr>
       <w:r>
-        <w:t>单中心座次图与主客方</w:t>
+        <w:t>座次工作台与图上换座</w:t>
       </w:r>
     </w:p>
     <w:p>
       <w:r>
-        <w:t>1. 打开会议详情“座次编排”，使用本次会议人员、手动添加或导入名单。</w:t>
+        <w:t>1. 打开会议详情“座次编排”。左侧读取本次会议人员、添加人员或导入名单；支持通讯录搜索和粘贴表格。</w:t>
       </w:r>
     </w:p>
     <w:p>
@@ -1522,12 +1476,12 @@
     </w:p>
     <w:p>
       <w:r>
-        <w:t>3. 选择主席台、长方桌会谈或圆桌等模板，设置门位、主位规则和中心方式，再生成座次。</w:t>
+        <w:t>3. 首次编排按会议已选会议室自动带入桌型；切换参考会议室也会带入对应模板，仍可临时改选布局。右侧“排座规则”设置入口、主位、主持人及中心方式，再生成座次。</w:t>
       </w:r>
     </w:p>
     <w:p>
       <w:r>
-        <w:t>4. 检查座次图、标签、分组表格及提醒。需要调位时用姓名选择交换席位。</w:t>
+        <w:t>4. 点击图中座位，右侧查看人员详情与席位标签。选择“交换席位”后点另一席，或在桌面上直接拖动换座。</w:t>
       </w:r>
     </w:p>
     <w:p>
@@ -1537,7 +1491,22 @@
     </w:p>
     <w:p>
       <w:r>
-        <w:t>默认 2 号在 1 号就座者的左手侧，即图上右侧。座次规则只是辅助建议，图示不是会议室实际尺寸图。</w:t>
+        <w:t>6. 关键席位可以锁定。重新生成会保留兼容布局中的锁定人员与位置；更换模板、入口或中心布局不兼容时，先解锁再生成。锁定随方案保存，重新打开仍存在。</w:t>
+      </w:r>
+    </w:p>
+    <w:p>
+      <w:r>
+        <w:t>7. 图形工具栏可放大、缩小或适应窗口；点击左侧人员可定位座位。用撤销/重做恢复本页最近 60 步操作，切换“分组表格”查看完整字段。</w:t>
+      </w:r>
+    </w:p>
+    <w:p>
+      <w:r>
+        <w:t>8. 修改人员或规则后，旧图保留并提示重新生成，此时暂不能保存或导出。粘贴的名单也须先读取或清空。保存与导出始终在工作台顶部。</w:t>
+      </w:r>
+    </w:p>
+    <w:p>
+      <w:r>
+        <w:t>默认 2 号在 1 号就座者的左手侧，即单排图上右侧；会谈双方根据各自朝向镜像排列。座次规则只是辅助建议，参考会议室不改变原预订场地，图示不是实测平面图，不按面积猜容量。</w:t>
       </w:r>
       <w:r>
         <w:rPr>
@@ -1546,18 +1515,19 @@
         <w:t>座次权重越大越靠前</w:t>
       </w:r>
       <w:r>
-        <w:t>；后台名单规则的优先级数字则越小越靠前。保存座次不覆盖原参会人员，也不自动开启名单治理。</w:t>
+        <w:t>；后台名单规则优先级越小越靠前。保存座次不覆盖参会人员，也不开启名单治理。撤销记录不跨刷新保存。</w:t>
       </w:r>
     </w:p>
     <w:p>
       <w:r>
-        <w:br w:type="page"/>
+        <w:t>长方桌带入普通会谈模板，不自动选择 5 对 5；圆桌带入圆桌模板；主席台 / 排座带入自动单/双中心；未配置桌型不替换当前布局。已保存的座次优先用原模板，不被后台桌型变化覆盖。主动换会议室后须核对并重新生成；锁定不兼容时先解锁。</w:t>
       </w:r>
     </w:p>
     <w:p>
       <w:bookmarkStart w:id="29" w:name="chapter_29"/>
       <w:pPr>
         <w:pStyle w:val="Heading1"/>
+        <w:pageBreakBefore/>
       </w:pPr>
       <w:r>
         <w:t>15  配置云端大模型</w:t>
@@ -1644,14 +1614,10 @@
       </w:r>
     </w:p>
     <w:p>
-      <w:r>
-        <w:br w:type="page"/>
-      </w:r>
-    </w:p>
-    <w:p>
       <w:bookmarkStart w:id="31" w:name="chapter_31"/>
       <w:pPr>
         <w:pStyle w:val="Heading1"/>
+        <w:pageBreakBefore/>
       </w:pPr>
       <w:r>
         <w:t>16  用智能助手联动系统</w:t>
@@ -1743,14 +1709,10 @@
       </w:r>
     </w:p>
     <w:p>
-      <w:r>
-        <w:br w:type="page"/>
-      </w:r>
-    </w:p>
-    <w:p>
       <w:bookmarkStart w:id="33" w:name="chapter_33"/>
       <w:pPr>
         <w:pStyle w:val="Heading1"/>
+        <w:pageBreakBefore/>
       </w:pPr>
       <w:r>
         <w:t>17  上传资料辅助填报会议</w:t>
@@ -1795,14 +1757,10 @@
       <w:r/>
     </w:p>
     <w:p>
-      <w:r>
-        <w:br w:type="page"/>
-      </w:r>
-    </w:p>
-    <w:p>
       <w:bookmarkStart w:id="35" w:name="chapter_35"/>
       <w:pPr>
         <w:pStyle w:val="Heading1"/>
+        <w:pageBreakBefore/>
       </w:pPr>
       <w:r>
         <w:t>18  维护人员通讯录</w:t>
@@ -1884,14 +1842,10 @@
       </w:r>
     </w:p>
     <w:p>
-      <w:r>
-        <w:br w:type="page"/>
-      </w:r>
-    </w:p>
-    <w:p>
       <w:bookmarkStart w:id="37" w:name="chapter_37"/>
       <w:pPr>
         <w:pStyle w:val="Heading1"/>
+        <w:pageBreakBefore/>
       </w:pPr>
       <w:r>
         <w:t>19  配置会议室</w:t>
@@ -1906,8 +1860,8 @@
       <w:r>
         <w:drawing>
           <wp:inline xmlns:a="http://schemas.openxmlformats.org/drawingml/2006/main" xmlns:pic="http://schemas.openxmlformats.org/drawingml/2006/picture">
-            <wp:extent cx="5943600" cy="2821107"/>
-            <wp:docPr id="17" name="Picture 17" descr="会议室资料与就近保存按钮"/>
+            <wp:extent cx="3960729" cy="2834640"/>
+            <wp:docPr id="17" name="Picture 17" descr="会议室桌型与场地资料"/>
             <wp:cNvGraphicFramePr>
               <a:graphicFrameLocks noChangeAspect="1"/>
             </wp:cNvGraphicFramePr>
@@ -1915,7 +1869,7 @@
               <a:graphicData uri="http://schemas.openxmlformats.org/drawingml/2006/picture">
                 <pic:pic>
                   <pic:nvPicPr>
-                    <pic:cNvPr id="0" name="16-room-management.jpg"/>
+                    <pic:cNvPr id="0" name="room-table-config.png"/>
                     <pic:cNvPicPr/>
                   </pic:nvPicPr>
                   <pic:blipFill>
@@ -1927,7 +1881,7 @@
                   <pic:spPr>
                     <a:xfrm>
                       <a:off x="0" y="0"/>
-                      <a:ext cx="5943600" cy="2821107"/>
+                      <a:ext cx="3960729" cy="2834640"/>
                     </a:xfrm>
                     <a:prstGeom prst="rect"/>
                   </pic:spPr>
@@ -1944,7 +1898,7 @@
         <w:jc w:val="center"/>
       </w:pPr>
       <w:r>
-        <w:t>会议室资料与就近保存按钮</w:t>
+        <w:t>会议室桌型与场地资料</w:t>
       </w:r>
     </w:p>
     <w:p>
@@ -1954,17 +1908,22 @@
     </w:p>
     <w:p>
       <w:r>
-        <w:t>2. 设备、场地要求可以每行填写一项；用启用开关决定是否供新会议选择。</w:t>
+        <w:t>2. 在“会议桌型”选择长方桌、圆桌 / 宴会式或主席台 / 排座，不确定时保留“未配置”。座次编排会据此自动选模板，仍可按本次会议临时调整。</w:t>
       </w:r>
     </w:p>
     <w:p>
       <w:r>
-        <w:t>3. 按需要设置默认会议室；不确定时保留“不预设会议室”。</w:t>
+        <w:t>3. 设备、场地要求可以每行填写一项；用启用开关决定是否供新会议选择。</w:t>
       </w:r>
     </w:p>
     <w:p>
       <w:r>
-        <w:t>4. 点击本页底部“保存会议室”。这个按钮只保存会议室，不会提交其他管理页的草稿。</w:t>
+        <w:t>4. 按需要设置默认会议室；不确定时保留“不预设会议室”。</w:t>
+      </w:r>
+    </w:p>
+    <w:p>
+      <w:r>
+        <w:t>5. 点击本页底部“保存会议室”。这个按钮只保存会议室，不会提交其他管理页的草稿。</w:t>
       </w:r>
     </w:p>
     <w:p>
@@ -1974,18 +1933,14 @@
     </w:p>
     <w:p>
       <w:r>
-        <w:t>容纳人数 0 表示未登记，不代表可坐 0 人；请按实际登记，不从面积或桌子尺寸推算。升级不覆盖已经维护的会议室信息。选房间后，场地资料作为本次会议快照保存。</w:t>
-      </w:r>
-    </w:p>
-    <w:p>
-      <w:r>
-        <w:br w:type="page"/>
+        <w:t>容纳人数 0 表示未登记，不代表可坐 0 人；请按实际登记，不从面积或桌子尺寸推算。内置和旧会议室默认未配置桌型，请按现场情况维护。升级不覆盖已经维护的会议室信息。选房间后，场地资料作为本次会议快照保存。</w:t>
       </w:r>
     </w:p>
     <w:p>
       <w:bookmarkStart w:id="39" w:name="chapter_39"/>
       <w:pPr>
         <w:pStyle w:val="Heading1"/>
+        <w:pageBreakBefore/>
       </w:pPr>
       <w:r>
         <w:t>20  统一单位全称与简称</w:t>
@@ -2067,14 +2022,10 @@
       </w:r>
     </w:p>
     <w:p>
-      <w:r>
-        <w:br w:type="page"/>
-      </w:r>
-    </w:p>
-    <w:p>
       <w:bookmarkStart w:id="41" w:name="chapter_41"/>
       <w:pPr>
         <w:pStyle w:val="Heading1"/>
+        <w:pageBreakBefore/>
       </w:pPr>
       <w:r>
         <w:t>21  配置排序、导出和会务模板</w:t>
@@ -2165,14 +2116,10 @@
       </w:r>
     </w:p>
     <w:p>
-      <w:r>
-        <w:br w:type="page"/>
-      </w:r>
-    </w:p>
-    <w:p>
       <w:bookmarkStart w:id="43" w:name="chapter_43"/>
       <w:pPr>
         <w:pStyle w:val="Heading1"/>
+        <w:pageBreakBefore/>
       </w:pPr>
       <w:r>
         <w:t>22  会议检索、复制与回收站</w:t>
@@ -2205,14 +2152,10 @@
       </w:r>
     </w:p>
     <w:p>
-      <w:r>
-        <w:br w:type="page"/>
-      </w:r>
-    </w:p>
-    <w:p>
       <w:bookmarkStart w:id="45" w:name="chapter_45"/>
       <w:pPr>
         <w:pStyle w:val="Heading1"/>
+        <w:pageBreakBefore/>
       </w:pPr>
       <w:r>
         <w:t>23  数据备份与迁移</w:t>
@@ -2251,12 +2194,12 @@
         <w:t>%LOCALAPPDATA%\MeetingAssistantAI</w:t>
       </w:r>
       <w:r>
-        <w:t>；便携版：EXE 旁“会务智办数据”。自定义数据目录以实际配置为准。</w:t>
+        <w:t>。自定义数据目录以实际配置为准。</w:t>
       </w:r>
     </w:p>
     <w:p>
       <w:r>
-        <w:t>5. 便携版换电脑时连同 EXE 和数据目录一起复制。浏览器和桌面版的模型 Key 不会自动互相复制。</w:t>
+        <w:t>5. 换电脑时先安装软件，再迁移已备份的数据；有现有数据时不要直接覆盖。历史便携数据仍在旧 EXE 旁“会务智办数据”，不会自动合并到安装版。浏览器和桌面版的模型 Key 不会自动互相复制。</w:t>
       </w:r>
     </w:p>
     <w:p>
@@ -2265,14 +2208,10 @@
       </w:r>
     </w:p>
     <w:p>
-      <w:r>
-        <w:br w:type="page"/>
-      </w:r>
-    </w:p>
-    <w:p>
       <w:bookmarkStart w:id="47" w:name="chapter_47"/>
       <w:pPr>
         <w:pStyle w:val="Heading1"/>
+        <w:pageBreakBefore/>
       </w:pPr>
       <w:r>
         <w:t>24  常见问题与完成检查</w:t>
@@ -2856,12 +2795,17 @@
     <w:p/>
     <w:p>
       <w:r>
+        <w:t>业务确认默认聚焦“取消”，按 Escape 可取消。若按钮可点但输入框无法聚焦，使用“视图 → 恢复输入焦点”（Ctrl+Shift+F6），或切到其他窗口再返回；无需刷新或重启。</w:t>
+      </w:r>
+    </w:p>
+    <w:p>
+      <w:r>
         <w:t>会前最后检查：会议时间地点正确；人员与预计人数已核对；停车、用餐、报销只开启需要的项；任务有负责人；正式名单和座次经人工确认；导出材料复查完成；重要资料原件另行归档。</w:t>
       </w:r>
     </w:p>
     <w:p>
       <w:r>
-        <w:t>更完整的功能边界见使用指南。本手册使用实际界面截图，但不将 AI 建议当作权威结论，也不宣称已完成外部审批或通知发送。</w:t>
+        <w:t>更多功能边界见使用指南。AI 建议须人工核对；本系统不提交外部审批或发送通知。</w:t>
       </w:r>
     </w:p>
     <w:sectPr>

</xml_diff>

<commit_message>
Release v3.1.5: in-app GitHub update checks, verified downloads and safe installer handoff
</commit_message>
<xml_diff>
--- a/docs/downloads/会务智办操作手册.docx
+++ b/docs/downloads/会务智办操作手册.docx
@@ -17,7 +17,7 @@
     </w:p>
     <w:p>
       <w:r>
-        <w:t>3.1.4    更新日期 2026-10-27</w:t>
+        <w:t>3.1.5    更新日期 2026-10-27</w:t>
       </w:r>
     </w:p>
     <w:p>
@@ -28,7 +28,7 @@
         <w:rPr>
           <w:b/>
         </w:rPr>
-        <w:t>3.1.4 安装版及源码</w:t>
+        <w:t>3.1.5 安装版及源码</w:t>
       </w:r>
       <w:r>
         <w:t>。更新日期：2026-10-27。桌面软件仅提供安装程序，安装后通过快捷方式使用。面向日常安排会议、维护名单和跟进会务事项的使用者。</w:t>
@@ -36,7 +36,7 @@
     </w:p>
     <w:p>
       <w:r>
-        <w:t>下载的 Word/PDF 与本页同步为 3.1.4，包含聊天历史保存、顶部会话切换与 AI 写入后页面自动更新；相关操作见第 17A 节及使用指南，旧截图不作为新界面的依据。</w:t>
+        <w:t>下载的 Word/PDF 与本页同步为 3.1.5，包含聊天历史保存、顶部会话切换与 AI 写入后页面自动更新；相关操作见第 17A 节及使用指南，旧截图不作为新界面的依据。</w:t>
       </w:r>
     </w:p>
     <w:p>
@@ -320,6 +320,16 @@
       <w:hyperlink w:anchor="chapter_51">
         <w:r>
           <w:t>25  快速查找和统一操作反馈</w:t>
+        </w:r>
+      </w:hyperlink>
+    </w:p>
+    <w:p>
+      <w:pPr>
+        <w:spacing w:after="60" w:line="240" w:lineRule="auto"/>
+      </w:pPr>
+      <w:hyperlink w:anchor="chapter_53">
+        <w:r>
+          <w:t>26  在软件中检查和安装更新</w:t>
         </w:r>
       </w:hyperlink>
     </w:p>
@@ -3077,8 +3087,112 @@
         <w:t>快速搜索在本机进行，不调用 AI。切换页签保留当前会话的工作内容，仍需按页面规则完成保存。</w:t>
       </w:r>
     </w:p>
+    <w:p>
+      <w:bookmarkStart w:id="53" w:name="chapter_53"/>
+      <w:pPr>
+        <w:pStyle w:val="Heading1"/>
+        <w:pageBreakBefore/>
+      </w:pPr>
+      <w:r>
+        <w:t>26  在软件中检查和安装更新</w:t>
+      </w:r>
+      <w:bookmarkEnd w:id="53"/>
+    </w:p>
+    <w:p>
+      <w:pPr>
+        <w:keepNext/>
+        <w:jc w:val="center"/>
+      </w:pPr>
+      <w:r>
+        <w:drawing>
+          <wp:inline xmlns:a="http://schemas.openxmlformats.org/drawingml/2006/main" xmlns:pic="http://schemas.openxmlformats.org/drawingml/2006/picture">
+            <wp:extent cx="3008584" cy="3383280"/>
+            <wp:docPr id="21" name="Picture 21" descr="软件更新窗口（独立验证环境示例）"/>
+            <wp:cNvGraphicFramePr>
+              <a:graphicFrameLocks noChangeAspect="1"/>
+            </wp:cNvGraphicFramePr>
+            <a:graphic>
+              <a:graphicData uri="http://schemas.openxmlformats.org/drawingml/2006/picture">
+                <pic:pic>
+                  <pic:nvPicPr>
+                    <pic:cNvPr id="0" name="software-update.png"/>
+                    <pic:cNvPicPr/>
+                  </pic:nvPicPr>
+                  <pic:blipFill>
+                    <a:blip r:embed="rId29"/>
+                    <a:stretch>
+                      <a:fillRect/>
+                    </a:stretch>
+                  </pic:blipFill>
+                  <pic:spPr>
+                    <a:xfrm>
+                      <a:off x="0" y="0"/>
+                      <a:ext cx="3008584" cy="3383280"/>
+                    </a:xfrm>
+                    <a:prstGeom prst="rect"/>
+                  </pic:spPr>
+                </pic:pic>
+              </a:graphicData>
+            </a:graphic>
+          </wp:inline>
+        </w:drawing>
+      </w:r>
+    </w:p>
+    <w:p>
+      <w:pPr>
+        <w:pStyle w:val="Caption"/>
+        <w:jc w:val="center"/>
+      </w:pPr>
+      <w:r>
+        <w:t>软件更新窗口（独立验证环境示例）</w:t>
+      </w:r>
+    </w:p>
+    <w:p>
+      <w:pPr>
+        <w:spacing w:after="100" w:line="276" w:lineRule="auto"/>
+      </w:pPr>
+      <w:r>
+        <w:rPr>
+          <w:sz w:val="21"/>
+        </w:rPr>
+        <w:t>上图来自独立测试环境，3.1.6 仅为演示版本号，不表示已正式发布。</w:t>
+      </w:r>
+    </w:p>
+    <w:p>
+      <w:pPr>
+        <w:spacing w:after="100" w:line="276" w:lineRule="auto"/>
+      </w:pPr>
+      <w:r>
+        <w:rPr>
+          <w:sz w:val="21"/>
+        </w:rPr>
+        <w:t>3.1.5 起，安装版启动约 10 秒后自动检查，运行期间每 6 小时再检查。手动检查点击窗口顶部菜单“会务智办 → 软件更新（当前版本）”。GitHub 仓库已公开，无需登录或配置令牌。</w:t>
+      </w:r>
+    </w:p>
+    <w:p>
+      <w:pPr>
+        <w:spacing w:after="100" w:line="276" w:lineRule="auto"/>
+      </w:pPr>
+      <w:r>
+        <w:rPr>
+          <w:sz w:val="21"/>
+        </w:rPr>
+        <w:t>发现新版后查看说明，点击“下载更新”；下载完成并校验通过后点击“退出并安装”。下载期间可以继续工作，关闭更新窗口不会取消下载。安装前先保存修改；有未保存内容时仍会提示，选择继续使用会取消本次安装。更新完成重新打开软件，业务数据和设置继续保留。</w:t>
+      </w:r>
+    </w:p>
+    <w:p>
+      <w:pPr>
+        <w:spacing w:after="100" w:line="276" w:lineRule="auto"/>
+      </w:pPr>
+      <w:r>
+        <w:rPr>
+          <w:sz w:val="21"/>
+        </w:rPr>
+        <w:t>3.1.4 及更早版本须先手动安装一次 3.1.5。网络或校验失败可重试，也可打开发布页手动下载安装。上述入口仅适用于 Windows 安装版，源码网页版及旧便携版不执行自动安装。</w:t>
+      </w:r>
+    </w:p>
     <w:sectPr>
-      <w:footerReference w:type="default" r:id="rId29"/>
+      <w:footerReference w:type="default" r:id="rId30"/>
       <w:pgSz w:w="12240" w:h="15840"/>
       <w:pgMar w:top="1152" w:right="1440" w:bottom="1152" w:left="1440" w:header="720" w:footer="504" w:gutter="0"/>
       <w:cols w:space="720"/>

</xml_diff>